<commit_message>
Clase 1 sin pruebas: solo Java puro con gradle run
Se quitan las pruebas JUnit y su configuración de Gradle. App muestra cada
ejemplo con más detalle porque la consola es la única evidencia. README,
guía de estudio, presentación y actividad enseñan a leer errores del
compilador en lugar de pruebas fallidas. La actividad pide una clase Tienda
que imprime 4 casos con gradle run.

Co-Authored-By: Claude Opus 5 (1M context) <noreply@anthropic.com>
Claude-Session: https://claude.ai/code/session_01L2JuF1iG72koPJkmuRWSzm
</commit_message>
<xml_diff>
--- a/material-de-apoyo/Clase1_Actividad_Java_POO.docx
+++ b/material-de-apoyo/Clase1_Actividad_Java_POO.docx
@@ -253,7 +253,7 @@
         <w:rPr>
           <w:b w:val="0"/>
         </w:rPr>
-        <w:t>, encapsulamiento, herencia y pruebas con JUnit.</w:t>
+        <w:t>, encapsulamiento y herencia. Al final un programa imprime en consola unos casos y tú comparas la salida con la que está en este documento.</w:t>
       </w:r>
     </w:p>
     <w:p>
@@ -309,7 +309,7 @@
         <w:rPr>
           <w:b w:val="0"/>
         </w:rPr>
-        <w:t>Trabaja dentro de una copia del proyecto de la clase, así ya tienes Gradle y JUnit configurados.</w:t>
+        <w:t>Trabaja dentro de una copia del proyecto de la clase, así ya tienes Gradle configurado.</w:t>
       </w:r>
     </w:p>
     <w:p>
@@ -409,6 +409,35 @@
         <w:rPr>
           <w:b w:val="0"/>
         </w:rPr>
+        <w:t xml:space="preserve">Corre </w:t>
+      </w:r>
+      <w:r>
+        <w:rPr>
+          <w:rFonts w:ascii="Consolas" w:hAnsi="Consolas" w:eastAsia="Consolas"/>
+          <w:color w:val="003D7A"/>
+        </w:rPr>
+        <w:t>gradle run</w:t>
+      </w:r>
+      <w:r>
+        <w:rPr>
+          <w:b w:val="0"/>
+        </w:rPr>
+        <w:t xml:space="preserve"> para confirmar que la copia funciona antes de empezar.</w:t>
+      </w:r>
+    </w:p>
+    <w:p>
+      <w:pPr>
+        <w:pStyle w:val="ListNumber"/>
+        <w:spacing w:after="60"/>
+        <w:numPr>
+          <w:ilvl w:val="0"/>
+          <w:numId w:val="10"/>
+        </w:numPr>
+      </w:pPr>
+      <w:r>
+        <w:rPr>
+          <w:b w:val="0"/>
+        </w:rPr>
         <w:t xml:space="preserve">Crea el paquete </w:t>
       </w:r>
       <w:r>
@@ -429,20 +458,7 @@
           <w:rFonts w:ascii="Consolas" w:hAnsi="Consolas" w:eastAsia="Consolas"/>
           <w:color w:val="003D7A"/>
         </w:rPr>
-        <w:t>src/main/java</w:t>
-      </w:r>
-      <w:r>
-        <w:rPr>
-          <w:b w:val="0"/>
-        </w:rPr>
-        <w:t xml:space="preserve"> y el mismo paquete dentro de </w:t>
-      </w:r>
-      <w:r>
-        <w:rPr>
-          <w:rFonts w:ascii="Consolas" w:hAnsi="Consolas" w:eastAsia="Consolas"/>
-          <w:color w:val="003D7A"/>
-        </w:rPr>
-        <w:t>src/test/java</w:t>
+        <w:t>src/main/java/co/com/semillero</w:t>
       </w:r>
       <w:r>
         <w:rPr>
@@ -464,21 +480,160 @@
         <w:rPr>
           <w:b w:val="0"/>
         </w:rPr>
-        <w:t xml:space="preserve">Corre </w:t>
+        <w:t xml:space="preserve">Abre </w:t>
       </w:r>
       <w:r>
         <w:rPr>
           <w:rFonts w:ascii="Consolas" w:hAnsi="Consolas" w:eastAsia="Consolas"/>
           <w:color w:val="003D7A"/>
         </w:rPr>
-        <w:t>gradle test</w:t>
+        <w:t>build.gradle</w:t>
       </w:r>
       <w:r>
         <w:rPr>
           <w:b w:val="0"/>
         </w:rPr>
-        <w:t xml:space="preserve"> para confirmar que la copia funciona antes de empezar.</w:t>
+        <w:t xml:space="preserve"> y cambia la línea de </w:t>
       </w:r>
+      <w:r>
+        <w:rPr>
+          <w:rFonts w:ascii="Consolas" w:hAnsi="Consolas" w:eastAsia="Consolas"/>
+          <w:color w:val="003D7A"/>
+        </w:rPr>
+        <w:t>mainClass</w:t>
+      </w:r>
+      <w:r>
+        <w:rPr>
+          <w:b w:val="0"/>
+        </w:rPr>
+        <w:t xml:space="preserve"> como se ve abajo. Así </w:t>
+      </w:r>
+      <w:r>
+        <w:rPr>
+          <w:rFonts w:ascii="Consolas" w:hAnsi="Consolas" w:eastAsia="Consolas"/>
+          <w:color w:val="003D7A"/>
+        </w:rPr>
+        <w:t>gradle run</w:t>
+      </w:r>
+      <w:r>
+        <w:rPr>
+          <w:b w:val="0"/>
+        </w:rPr>
+        <w:t xml:space="preserve"> ejecuta tu tienda y no los ejemplos de la clase.</w:t>
+      </w:r>
+    </w:p>
+    <w:tbl>
+      <w:tblPr>
+        <w:tblW w:type="auto" w:w="0"/>
+        <w:jc w:val="center"/>
+        <w:tblLook w:firstColumn="1" w:firstRow="1" w:lastColumn="0" w:lastRow="0" w:noHBand="0" w:noVBand="1" w:val="04A0"/>
+      </w:tblPr>
+      <w:tblGrid>
+        <w:gridCol w:w="9632"/>
+      </w:tblGrid>
+      <w:tr>
+        <w:trPr>
+          <w:cantSplit/>
+        </w:trPr>
+        <w:tc>
+          <w:tcPr>
+            <w:tcW w:type="dxa" w:w="9632"/>
+            <w:shd w:val="clear" w:color="auto" w:fill="F2F5F9"/>
+            <w:tcBorders>
+              <w:top w:val="nil"/>
+              <w:left w:val="single" w:sz="18" w:color="0072BC"/>
+              <w:bottom w:val="nil"/>
+              <w:right w:val="nil"/>
+            </w:tcBorders>
+          </w:tcPr>
+          <w:p>
+            <w:r/>
+            <w:r>
+              <w:rPr>
+                <w:b/>
+                <w:color w:val="52606D"/>
+                <w:sz w:val="18"/>
+              </w:rPr>
+              <w:t>build.gradle, dentro del bloque application</w:t>
+            </w:r>
+          </w:p>
+          <w:p>
+            <w:pPr>
+              <w:keepNext/>
+              <w:spacing w:after="0" w:line="240" w:lineRule="auto"/>
+            </w:pPr>
+            <w:r>
+              <w:rPr>
+                <w:rFonts w:ascii="Consolas" w:hAnsi="Consolas" w:eastAsia="Consolas"/>
+                <w:color w:val="1F2933"/>
+                <w:sz w:val="19"/>
+              </w:rPr>
+              <w:t>// Antes</w:t>
+            </w:r>
+          </w:p>
+          <w:p>
+            <w:pPr>
+              <w:keepNext/>
+              <w:spacing w:after="0" w:line="240" w:lineRule="auto"/>
+            </w:pPr>
+            <w:r>
+              <w:rPr>
+                <w:rFonts w:ascii="Consolas" w:hAnsi="Consolas" w:eastAsia="Consolas"/>
+                <w:color w:val="1F2933"/>
+                <w:sz w:val="19"/>
+              </w:rPr>
+              <w:t>mainClass = 'co.com.semillero.App'</w:t>
+            </w:r>
+          </w:p>
+          <w:p>
+            <w:pPr>
+              <w:keepNext/>
+              <w:spacing w:after="0" w:line="240" w:lineRule="auto"/>
+            </w:pPr>
+            <w:r>
+              <w:rPr>
+                <w:rFonts w:ascii="Consolas" w:hAnsi="Consolas" w:eastAsia="Consolas"/>
+                <w:color w:val="1F2933"/>
+                <w:sz w:val="19"/>
+              </w:rPr>
+              <w:t xml:space="preserve"> </w:t>
+            </w:r>
+          </w:p>
+          <w:p>
+            <w:pPr>
+              <w:keepNext/>
+              <w:spacing w:after="0" w:line="240" w:lineRule="auto"/>
+            </w:pPr>
+            <w:r>
+              <w:rPr>
+                <w:rFonts w:ascii="Consolas" w:hAnsi="Consolas" w:eastAsia="Consolas"/>
+                <w:color w:val="1F2933"/>
+                <w:sz w:val="19"/>
+              </w:rPr>
+              <w:t>// Después</w:t>
+            </w:r>
+          </w:p>
+          <w:p>
+            <w:pPr>
+              <w:keepNext/>
+              <w:spacing w:after="0" w:line="240" w:lineRule="auto"/>
+            </w:pPr>
+            <w:r>
+              <w:rPr>
+                <w:rFonts w:ascii="Consolas" w:hAnsi="Consolas" w:eastAsia="Consolas"/>
+                <w:color w:val="1F2933"/>
+                <w:sz w:val="19"/>
+              </w:rPr>
+              <w:t>mainClass = 'co.com.semillero.actividad.Tienda'</w:t>
+            </w:r>
+          </w:p>
+        </w:tc>
+      </w:tr>
+    </w:tbl>
+    <w:p>
+      <w:pPr>
+        <w:spacing w:after="40"/>
+      </w:pPr>
     </w:p>
     <w:p>
       <w:pPr>
@@ -940,10 +1095,13 @@
           <w:color w:val="0072BC"/>
           <w:sz w:val="28"/>
         </w:rPr>
-        <w:t>3. Pruebas</w:t>
+        <w:t>3. Clase Tienda</w:t>
       </w:r>
     </w:p>
     <w:p>
+      <w:pPr>
+        <w:keepNext/>
+      </w:pPr>
       <w:r>
         <w:rPr>
           <w:b w:val="0"/>
@@ -955,52 +1113,39 @@
           <w:rFonts w:ascii="Consolas" w:hAnsi="Consolas" w:eastAsia="Consolas"/>
           <w:color w:val="003D7A"/>
         </w:rPr>
-        <w:t>ProductoTest.java</w:t>
+        <w:t>Tienda.java</w:t>
       </w:r>
       <w:r>
         <w:rPr>
           <w:b w:val="0"/>
         </w:rPr>
-        <w:t xml:space="preserve"> en </w:t>
+        <w:t xml:space="preserve"> en el mismo paquete, con un método </w:t>
       </w:r>
       <w:r>
         <w:rPr>
           <w:rFonts w:ascii="Consolas" w:hAnsi="Consolas" w:eastAsia="Consolas"/>
           <w:color w:val="003D7A"/>
         </w:rPr>
-        <w:t>src/test/java/co/com/semillero/actividad</w:t>
+        <w:t>main</w:t>
       </w:r>
       <w:r>
         <w:rPr>
           <w:b w:val="0"/>
         </w:rPr>
-        <w:t xml:space="preserve"> con estas 4 pruebas. Cada una debe tener </w:t>
+        <w:t xml:space="preserve">. Ahí creas los productos e imprimes estos 4 casos con </w:t>
       </w:r>
       <w:r>
         <w:rPr>
           <w:rFonts w:ascii="Consolas" w:hAnsi="Consolas" w:eastAsia="Consolas"/>
           <w:color w:val="003D7A"/>
         </w:rPr>
-        <w:t>@Test</w:t>
+        <w:t>System.out.println</w:t>
       </w:r>
       <w:r>
         <w:rPr>
           <w:b w:val="0"/>
         </w:rPr>
-        <w:t xml:space="preserve">, un </w:t>
-      </w:r>
-      <w:r>
-        <w:rPr>
-          <w:rFonts w:ascii="Consolas" w:hAnsi="Consolas" w:eastAsia="Consolas"/>
-          <w:color w:val="003D7A"/>
-        </w:rPr>
-        <w:t>@DisplayName</w:t>
-      </w:r>
-      <w:r>
-        <w:rPr>
-          <w:b w:val="0"/>
-        </w:rPr>
-        <w:t xml:space="preserve"> en español y un comentario encima que diga qué revisa.</w:t>
+        <w:t>:</w:t>
       </w:r>
     </w:p>
     <w:tbl>
@@ -1020,7 +1165,7 @@
         </w:trPr>
         <w:tc>
           <w:tcPr>
-            <w:tcW w:type="dxa" w:w="1928"/>
+            <w:tcW w:type="dxa" w:w="1814"/>
             <w:shd w:val="clear" w:color="auto" w:fill="003D7A"/>
             <w:tcBorders>
               <w:top w:val="single" w:sz="6" w:color="D0D7DE"/>
@@ -1039,13 +1184,13 @@
                 <w:color w:val="FFFFFF"/>
                 <w:sz w:val="20"/>
               </w:rPr>
-              <w:t>Prueba</w:t>
+              <w:t>Caso</w:t>
             </w:r>
           </w:p>
         </w:tc>
         <w:tc>
           <w:tcPr>
-            <w:tcW w:type="dxa" w:w="3402"/>
+            <w:tcW w:type="dxa" w:w="6009"/>
             <w:shd w:val="clear" w:color="auto" w:fill="003D7A"/>
             <w:tcBorders>
               <w:top w:val="single" w:sz="6" w:color="D0D7DE"/>
@@ -1064,13 +1209,13 @@
                 <w:color w:val="FFFFFF"/>
                 <w:sz w:val="20"/>
               </w:rPr>
-              <w:t>Datos</w:t>
+              <w:t>Qué haces</w:t>
             </w:r>
           </w:p>
         </w:tc>
         <w:tc>
           <w:tcPr>
-            <w:tcW w:type="dxa" w:w="3742"/>
+            <w:tcW w:type="dxa" w:w="1247"/>
             <w:shd w:val="clear" w:color="auto" w:fill="003D7A"/>
             <w:tcBorders>
               <w:top w:val="single" w:sz="6" w:color="D0D7DE"/>
@@ -1089,7 +1234,7 @@
                 <w:color w:val="FFFFFF"/>
                 <w:sz w:val="20"/>
               </w:rPr>
-              <w:t>Resultado esperado</w:t>
+              <w:t>Debe salir</w:t>
             </w:r>
           </w:p>
         </w:tc>
@@ -1100,7 +1245,7 @@
         </w:trPr>
         <w:tc>
           <w:tcPr>
-            <w:tcW w:type="dxa" w:w="1928"/>
+            <w:tcW w:type="dxa" w:w="1814"/>
             <w:tcBorders>
               <w:top w:val="single" w:sz="6" w:color="D0D7DE"/>
               <w:left w:val="single" w:sz="6" w:color="D0D7DE"/>
@@ -1117,13 +1262,13 @@
                 <w:b w:val="0"/>
                 <w:sz w:val="20"/>
               </w:rPr>
-              <w:t>Precio negativo</w:t>
+              <w:t>1. Precio negativo</w:t>
             </w:r>
           </w:p>
         </w:tc>
         <w:tc>
           <w:tcPr>
-            <w:tcW w:type="dxa" w:w="3402"/>
+            <w:tcW w:type="dxa" w:w="6009"/>
             <w:tcBorders>
               <w:top w:val="single" w:sz="6" w:color="D0D7DE"/>
               <w:left w:val="single" w:sz="6" w:color="D0D7DE"/>
@@ -1137,6 +1282,13 @@
             </w:pPr>
             <w:r>
               <w:rPr>
+                <w:b w:val="0"/>
+                <w:sz w:val="20"/>
+              </w:rPr>
+              <w:t xml:space="preserve">Producto Mouse de 45000 y luego </w:t>
+            </w:r>
+            <w:r>
+              <w:rPr>
                 <w:rFonts w:ascii="Consolas" w:hAnsi="Consolas" w:eastAsia="Consolas"/>
                 <w:color w:val="003D7A"/>
                 <w:sz w:val="20"/>
@@ -1148,13 +1300,21 @@
                 <w:b w:val="0"/>
                 <w:sz w:val="20"/>
               </w:rPr>
-              <w:t xml:space="preserve"> a uno de 45000</w:t>
+              <w:t xml:space="preserve">; imprime </w:t>
+            </w:r>
+            <w:r>
+              <w:rPr>
+                <w:rFonts w:ascii="Consolas" w:hAnsi="Consolas" w:eastAsia="Consolas"/>
+                <w:color w:val="003D7A"/>
+                <w:sz w:val="20"/>
+              </w:rPr>
+              <w:t>getPrecio()</w:t>
             </w:r>
           </w:p>
         </w:tc>
         <w:tc>
           <w:tcPr>
-            <w:tcW w:type="dxa" w:w="3742"/>
+            <w:tcW w:type="dxa" w:w="1247"/>
             <w:tcBorders>
               <w:top w:val="single" w:sz="6" w:color="D0D7DE"/>
               <w:left w:val="single" w:sz="6" w:color="D0D7DE"/>
@@ -1168,18 +1328,10 @@
             </w:pPr>
             <w:r>
               <w:rPr>
-                <w:rFonts w:ascii="Consolas" w:hAnsi="Consolas" w:eastAsia="Consolas"/>
-                <w:color w:val="003D7A"/>
-                <w:sz w:val="20"/>
-              </w:rPr>
-              <w:t>getPrecio()</w:t>
-            </w:r>
-            <w:r>
-              <w:rPr>
                 <w:b w:val="0"/>
                 <w:sz w:val="20"/>
               </w:rPr>
-              <w:t xml:space="preserve"> sigue en 45000</w:t>
+              <w:t>45000.0</w:t>
             </w:r>
           </w:p>
         </w:tc>
@@ -1190,7 +1342,7 @@
         </w:trPr>
         <w:tc>
           <w:tcPr>
-            <w:tcW w:type="dxa" w:w="1928"/>
+            <w:tcW w:type="dxa" w:w="1814"/>
             <w:shd w:val="clear" w:color="auto" w:fill="F2F5F9"/>
             <w:tcBorders>
               <w:top w:val="single" w:sz="6" w:color="D0D7DE"/>
@@ -1208,13 +1360,13 @@
                 <w:b w:val="0"/>
                 <w:sz w:val="20"/>
               </w:rPr>
-              <w:t>Con descuento</w:t>
+              <w:t>2. Con descuento</w:t>
             </w:r>
           </w:p>
         </w:tc>
         <w:tc>
           <w:tcPr>
-            <w:tcW w:type="dxa" w:w="3402"/>
+            <w:tcW w:type="dxa" w:w="6009"/>
             <w:shd w:val="clear" w:color="auto" w:fill="F2F5F9"/>
             <w:tcBorders>
               <w:top w:val="single" w:sz="6" w:color="D0D7DE"/>
@@ -1232,25 +1384,8 @@
                 <w:b w:val="0"/>
                 <w:sz w:val="20"/>
               </w:rPr>
-              <w:t>Producto de 200000</w:t>
+              <w:t xml:space="preserve">Producto Monitor de 200000; imprime </w:t>
             </w:r>
-          </w:p>
-        </w:tc>
-        <w:tc>
-          <w:tcPr>
-            <w:tcW w:type="dxa" w:w="3742"/>
-            <w:shd w:val="clear" w:color="auto" w:fill="F2F5F9"/>
-            <w:tcBorders>
-              <w:top w:val="single" w:sz="6" w:color="D0D7DE"/>
-              <w:left w:val="single" w:sz="6" w:color="D0D7DE"/>
-              <w:bottom w:val="single" w:sz="6" w:color="D0D7DE"/>
-              <w:right w:val="single" w:sz="6" w:color="D0D7DE"/>
-            </w:tcBorders>
-          </w:tcPr>
-          <w:p>
-            <w:pPr>
-              <w:keepNext/>
-            </w:pPr>
             <w:r>
               <w:rPr>
                 <w:rFonts w:ascii="Consolas" w:hAnsi="Consolas" w:eastAsia="Consolas"/>
@@ -1259,23 +1394,12 @@
               </w:rPr>
               <w:t>calcularPrecioFinal()</w:t>
             </w:r>
-            <w:r>
-              <w:rPr>
-                <w:b w:val="0"/>
-                <w:sz w:val="20"/>
-              </w:rPr>
-              <w:t xml:space="preserve"> da 180000</w:t>
-            </w:r>
           </w:p>
         </w:tc>
-      </w:tr>
-      <w:tr>
-        <w:trPr>
-          <w:cantSplit/>
-        </w:trPr>
         <w:tc>
           <w:tcPr>
-            <w:tcW w:type="dxa" w:w="1928"/>
+            <w:tcW w:type="dxa" w:w="1247"/>
+            <w:shd w:val="clear" w:color="auto" w:fill="F2F5F9"/>
             <w:tcBorders>
               <w:top w:val="single" w:sz="6" w:color="D0D7DE"/>
               <w:left w:val="single" w:sz="6" w:color="D0D7DE"/>
@@ -1292,13 +1416,18 @@
                 <w:b w:val="0"/>
                 <w:sz w:val="20"/>
               </w:rPr>
-              <w:t>Sin descuento</w:t>
+              <w:t>180000.0</w:t>
             </w:r>
           </w:p>
         </w:tc>
+      </w:tr>
+      <w:tr>
+        <w:trPr>
+          <w:cantSplit/>
+        </w:trPr>
         <w:tc>
           <w:tcPr>
-            <w:tcW w:type="dxa" w:w="3402"/>
+            <w:tcW w:type="dxa" w:w="1814"/>
             <w:tcBorders>
               <w:top w:val="single" w:sz="6" w:color="D0D7DE"/>
               <w:left w:val="single" w:sz="6" w:color="D0D7DE"/>
@@ -1315,13 +1444,13 @@
                 <w:b w:val="0"/>
                 <w:sz w:val="20"/>
               </w:rPr>
-              <w:t>Producto de 45000</w:t>
+              <w:t>3. Sin descuento</w:t>
             </w:r>
           </w:p>
         </w:tc>
         <w:tc>
           <w:tcPr>
-            <w:tcW w:type="dxa" w:w="3742"/>
+            <w:tcW w:type="dxa" w:w="6009"/>
             <w:tcBorders>
               <w:top w:val="single" w:sz="6" w:color="D0D7DE"/>
               <w:left w:val="single" w:sz="6" w:color="D0D7DE"/>
@@ -1335,18 +1464,41 @@
             </w:pPr>
             <w:r>
               <w:rPr>
+                <w:b w:val="0"/>
+                <w:sz w:val="20"/>
+              </w:rPr>
+              <w:t xml:space="preserve">Producto Mouse de 45000; imprime </w:t>
+            </w:r>
+            <w:r>
+              <w:rPr>
                 <w:rFonts w:ascii="Consolas" w:hAnsi="Consolas" w:eastAsia="Consolas"/>
                 <w:color w:val="003D7A"/>
                 <w:sz w:val="20"/>
               </w:rPr>
               <w:t>calcularPrecioFinal()</w:t>
             </w:r>
+          </w:p>
+        </w:tc>
+        <w:tc>
+          <w:tcPr>
+            <w:tcW w:type="dxa" w:w="1247"/>
+            <w:tcBorders>
+              <w:top w:val="single" w:sz="6" w:color="D0D7DE"/>
+              <w:left w:val="single" w:sz="6" w:color="D0D7DE"/>
+              <w:bottom w:val="single" w:sz="6" w:color="D0D7DE"/>
+              <w:right w:val="single" w:sz="6" w:color="D0D7DE"/>
+            </w:tcBorders>
+          </w:tcPr>
+          <w:p>
+            <w:pPr>
+              <w:keepNext/>
+            </w:pPr>
             <w:r>
               <w:rPr>
                 <w:b w:val="0"/>
                 <w:sz w:val="20"/>
               </w:rPr>
-              <w:t xml:space="preserve"> da 45000</w:t>
+              <w:t>45000.0</w:t>
             </w:r>
           </w:p>
         </w:tc>
@@ -1357,7 +1509,7 @@
         </w:trPr>
         <w:tc>
           <w:tcPr>
-            <w:tcW w:type="dxa" w:w="1928"/>
+            <w:tcW w:type="dxa" w:w="1814"/>
             <w:shd w:val="clear" w:color="auto" w:fill="F2F5F9"/>
             <w:tcBorders>
               <w:top w:val="single" w:sz="6" w:color="D0D7DE"/>
@@ -1372,13 +1524,13 @@
                 <w:b w:val="0"/>
                 <w:sz w:val="20"/>
               </w:rPr>
-              <w:t>Producto en oferta</w:t>
+              <w:t>4. En oferta</w:t>
             </w:r>
           </w:p>
         </w:tc>
         <w:tc>
           <w:tcPr>
-            <w:tcW w:type="dxa" w:w="3402"/>
+            <w:tcW w:type="dxa" w:w="6009"/>
             <w:shd w:val="clear" w:color="auto" w:fill="F2F5F9"/>
             <w:tcBorders>
               <w:top w:val="single" w:sz="6" w:color="D0D7DE"/>
@@ -1401,13 +1553,21 @@
                 <w:b w:val="0"/>
                 <w:sz w:val="20"/>
               </w:rPr>
-              <w:t xml:space="preserve"> de 80000</w:t>
+              <w:t xml:space="preserve"> Teclado de 80000; imprime </w:t>
+            </w:r>
+            <w:r>
+              <w:rPr>
+                <w:rFonts w:ascii="Consolas" w:hAnsi="Consolas" w:eastAsia="Consolas"/>
+                <w:color w:val="003D7A"/>
+                <w:sz w:val="20"/>
+              </w:rPr>
+              <w:t>calcularPrecioFinal()</w:t>
             </w:r>
           </w:p>
         </w:tc>
         <w:tc>
           <w:tcPr>
-            <w:tcW w:type="dxa" w:w="3742"/>
+            <w:tcW w:type="dxa" w:w="1247"/>
             <w:shd w:val="clear" w:color="auto" w:fill="F2F5F9"/>
             <w:tcBorders>
               <w:top w:val="single" w:sz="6" w:color="D0D7DE"/>
@@ -1419,18 +1579,161 @@
           <w:p>
             <w:r>
               <w:rPr>
-                <w:rFonts w:ascii="Consolas" w:hAnsi="Consolas" w:eastAsia="Consolas"/>
-                <w:color w:val="003D7A"/>
-                <w:sz w:val="20"/>
-              </w:rPr>
-              <w:t>calcularPrecioFinal()</w:t>
-            </w:r>
-            <w:r>
-              <w:rPr>
                 <w:b w:val="0"/>
                 <w:sz w:val="20"/>
               </w:rPr>
-              <w:t xml:space="preserve"> da 64000</w:t>
+              <w:t>64000.0</w:t>
+            </w:r>
+          </w:p>
+        </w:tc>
+      </w:tr>
+    </w:tbl>
+    <w:p>
+      <w:pPr>
+        <w:spacing w:after="40"/>
+      </w:pPr>
+    </w:p>
+    <w:p>
+      <w:pPr>
+        <w:keepNext/>
+      </w:pPr>
+      <w:r>
+        <w:rPr>
+          <w:b w:val="0"/>
+        </w:rPr>
+        <w:t xml:space="preserve">Corre </w:t>
+      </w:r>
+      <w:r>
+        <w:rPr>
+          <w:rFonts w:ascii="Consolas" w:hAnsi="Consolas" w:eastAsia="Consolas"/>
+          <w:color w:val="003D7A"/>
+        </w:rPr>
+        <w:t>gradle run</w:t>
+      </w:r>
+      <w:r>
+        <w:rPr>
+          <w:b w:val="0"/>
+        </w:rPr>
+        <w:t>. Tu salida no tiene que tener las mismas palabras, pero sí los mismos números. Por ejemplo:</w:t>
+      </w:r>
+    </w:p>
+    <w:tbl>
+      <w:tblPr>
+        <w:tblW w:type="auto" w:w="0"/>
+        <w:jc w:val="center"/>
+        <w:tblLook w:firstColumn="1" w:firstRow="1" w:lastColumn="0" w:lastRow="0" w:noHBand="0" w:noVBand="1" w:val="04A0"/>
+      </w:tblPr>
+      <w:tblGrid>
+        <w:gridCol w:w="9632"/>
+      </w:tblGrid>
+      <w:tr>
+        <w:trPr>
+          <w:cantSplit/>
+        </w:trPr>
+        <w:tc>
+          <w:tcPr>
+            <w:tcW w:type="dxa" w:w="9632"/>
+            <w:shd w:val="clear" w:color="auto" w:fill="F2F5F9"/>
+            <w:tcBorders>
+              <w:top w:val="nil"/>
+              <w:left w:val="single" w:sz="18" w:color="0072BC"/>
+              <w:bottom w:val="nil"/>
+              <w:right w:val="nil"/>
+            </w:tcBorders>
+          </w:tcPr>
+          <w:p>
+            <w:r/>
+            <w:r>
+              <w:rPr>
+                <w:b/>
+                <w:color w:val="52606D"/>
+                <w:sz w:val="18"/>
+              </w:rPr>
+              <w:t>Salida esperada de gradle run</w:t>
+            </w:r>
+          </w:p>
+          <w:p>
+            <w:pPr>
+              <w:keepNext/>
+              <w:spacing w:after="0" w:line="240" w:lineRule="auto"/>
+            </w:pPr>
+            <w:r>
+              <w:rPr>
+                <w:rFonts w:ascii="Consolas" w:hAnsi="Consolas" w:eastAsia="Consolas"/>
+                <w:color w:val="1F2933"/>
+                <w:sz w:val="19"/>
+              </w:rPr>
+              <w:t>Caso 1. Mouse despues de setPrecio(-5000): 45000.0</w:t>
+            </w:r>
+          </w:p>
+          <w:p>
+            <w:pPr>
+              <w:keepNext/>
+              <w:spacing w:after="0" w:line="240" w:lineRule="auto"/>
+            </w:pPr>
+            <w:r>
+              <w:rPr>
+                <w:rFonts w:ascii="Consolas" w:hAnsi="Consolas" w:eastAsia="Consolas"/>
+                <w:color w:val="1F2933"/>
+                <w:sz w:val="19"/>
+              </w:rPr>
+              <w:t>Caso 2. Monitor de 200000, precio final: 180000.0</w:t>
+            </w:r>
+          </w:p>
+          <w:p>
+            <w:pPr>
+              <w:keepNext/>
+              <w:spacing w:after="0" w:line="240" w:lineRule="auto"/>
+            </w:pPr>
+            <w:r>
+              <w:rPr>
+                <w:rFonts w:ascii="Consolas" w:hAnsi="Consolas" w:eastAsia="Consolas"/>
+                <w:color w:val="1F2933"/>
+                <w:sz w:val="19"/>
+              </w:rPr>
+              <w:t>Caso 3. Mouse de 45000, precio final: 45000.0</w:t>
+            </w:r>
+          </w:p>
+          <w:p>
+            <w:pPr>
+              <w:keepNext/>
+              <w:spacing w:after="0" w:line="240" w:lineRule="auto"/>
+            </w:pPr>
+            <w:r>
+              <w:rPr>
+                <w:rFonts w:ascii="Consolas" w:hAnsi="Consolas" w:eastAsia="Consolas"/>
+                <w:color w:val="1F2933"/>
+                <w:sz w:val="19"/>
+              </w:rPr>
+              <w:t>Caso 4. Teclado en oferta de 80000, precio final: 64000.0</w:t>
+            </w:r>
+          </w:p>
+          <w:p>
+            <w:pPr>
+              <w:keepNext/>
+              <w:spacing w:after="0" w:line="240" w:lineRule="auto"/>
+            </w:pPr>
+            <w:r>
+              <w:rPr>
+                <w:rFonts w:ascii="Consolas" w:hAnsi="Consolas" w:eastAsia="Consolas"/>
+                <w:color w:val="1F2933"/>
+                <w:sz w:val="19"/>
+              </w:rPr>
+              <w:t xml:space="preserve"> </w:t>
+            </w:r>
+          </w:p>
+          <w:p>
+            <w:pPr>
+              <w:keepNext/>
+              <w:spacing w:after="0" w:line="240" w:lineRule="auto"/>
+            </w:pPr>
+            <w:r>
+              <w:rPr>
+                <w:rFonts w:ascii="Consolas" w:hAnsi="Consolas" w:eastAsia="Consolas"/>
+                <w:color w:val="1F2933"/>
+                <w:sz w:val="19"/>
+              </w:rPr>
+              <w:t>BUILD SUCCESSFUL in 1s</w:t>
             </w:r>
           </w:p>
         </w:tc>
@@ -1446,72 +1749,46 @@
         <w:rPr>
           <w:b w:val="0"/>
         </w:rPr>
-        <w:t xml:space="preserve">Como el precio es </w:t>
+        <w:t xml:space="preserve">Si un número no coincide, revisa el </w:t>
       </w:r>
       <w:r>
         <w:rPr>
           <w:rFonts w:ascii="Consolas" w:hAnsi="Consolas" w:eastAsia="Consolas"/>
           <w:color w:val="003D7A"/>
         </w:rPr>
-        <w:t>double</w:t>
+        <w:t>if</w:t>
       </w:r>
       <w:r>
         <w:rPr>
           <w:b w:val="0"/>
         </w:rPr>
-        <w:t xml:space="preserve">, compara con un margen pequeño, así: </w:t>
+        <w:t xml:space="preserve"> o el </w:t>
       </w:r>
       <w:r>
         <w:rPr>
           <w:rFonts w:ascii="Consolas" w:hAnsi="Consolas" w:eastAsia="Consolas"/>
           <w:color w:val="003D7A"/>
         </w:rPr>
-        <w:t>assertEquals(180000, producto.calcularPrecioFinal(), 0.001)</w:t>
+        <w:t>@Override</w:t>
       </w:r>
       <w:r>
         <w:rPr>
           <w:b w:val="0"/>
         </w:rPr>
-        <w:t xml:space="preserve">. Cuando termines, corre </w:t>
+        <w:t xml:space="preserve">. Si sale </w:t>
       </w:r>
       <w:r>
         <w:rPr>
           <w:rFonts w:ascii="Consolas" w:hAnsi="Consolas" w:eastAsia="Consolas"/>
           <w:color w:val="003D7A"/>
         </w:rPr>
-        <w:t>gradle test</w:t>
+        <w:t>BUILD FAILED</w:t>
       </w:r>
       <w:r>
         <w:rPr>
           <w:b w:val="0"/>
         </w:rPr>
-        <w:t xml:space="preserve"> y revisa que todas las pruebas digan </w:t>
-      </w:r>
-      <w:r>
-        <w:rPr>
-          <w:rFonts w:ascii="Consolas" w:hAnsi="Consolas" w:eastAsia="Consolas"/>
-          <w:color w:val="003D7A"/>
-        </w:rPr>
-        <w:t>PASSED</w:t>
-      </w:r>
-      <w:r>
-        <w:rPr>
-          <w:b w:val="0"/>
-        </w:rPr>
-        <w:t xml:space="preserve"> y el final diga </w:t>
-      </w:r>
-      <w:r>
-        <w:rPr>
-          <w:rFonts w:ascii="Consolas" w:hAnsi="Consolas" w:eastAsia="Consolas"/>
-          <w:color w:val="003D7A"/>
-        </w:rPr>
-        <w:t>BUILD SUCCESSFUL</w:t>
-      </w:r>
-      <w:r>
-        <w:rPr>
-          <w:b w:val="0"/>
-        </w:rPr>
-        <w:t>.</w:t>
+        <w:t>, lee el error como lo vimos en clase: archivo, línea y mensaje. No uses tildes en los textos que imprimes.</w:t>
       </w:r>
     </w:p>
     <w:p>
@@ -1588,7 +1865,33 @@
         <w:rPr>
           <w:b w:val="0"/>
         </w:rPr>
-        <w:t xml:space="preserve"> y sume el precio final de cada producto. Escribe una prueba que agregue tres productos (uno de ellos en oferta) y revise el total.</w:t>
+        <w:t xml:space="preserve"> y sume el precio final de cada producto. En </w:t>
+      </w:r>
+      <w:r>
+        <w:rPr>
+          <w:rFonts w:ascii="Consolas" w:hAnsi="Consolas" w:eastAsia="Consolas"/>
+          <w:color w:val="003D7A"/>
+        </w:rPr>
+        <w:t>Tienda</w:t>
+      </w:r>
+      <w:r>
+        <w:rPr>
+          <w:b w:val="0"/>
+        </w:rPr>
+        <w:t xml:space="preserve"> agrega los tres productos de los casos 2, 3 y 4 e imprime el total. Debe dar </w:t>
+      </w:r>
+      <w:r>
+        <w:rPr>
+          <w:rFonts w:ascii="Consolas" w:hAnsi="Consolas" w:eastAsia="Consolas"/>
+          <w:color w:val="003D7A"/>
+        </w:rPr>
+        <w:t>289000.0</w:t>
+      </w:r>
+      <w:r>
+        <w:rPr>
+          <w:b w:val="0"/>
+        </w:rPr>
+        <w:t>.</w:t>
       </w:r>
     </w:p>
     <w:p>
@@ -1695,20 +1998,20 @@
         <w:rPr>
           <w:b w:val="0"/>
         </w:rPr>
-        <w:t xml:space="preserve">En los dos casos adjunta una captura de pantalla de PowerShell donde se vea </w:t>
+        <w:t xml:space="preserve">En los dos casos adjunta una captura de pantalla de PowerShell con la salida de </w:t>
       </w:r>
       <w:r>
         <w:rPr>
           <w:rFonts w:ascii="Consolas" w:hAnsi="Consolas" w:eastAsia="Consolas"/>
           <w:color w:val="003D7A"/>
         </w:rPr>
-        <w:t>gradle test</w:t>
+        <w:t>gradle run</w:t>
       </w:r>
       <w:r>
         <w:rPr>
           <w:b w:val="0"/>
         </w:rPr>
-        <w:t xml:space="preserve"> terminando en </w:t>
+        <w:t xml:space="preserve">: los 4 casos y </w:t>
       </w:r>
       <w:r>
         <w:rPr>
@@ -1721,7 +2024,7 @@
         <w:rPr>
           <w:b w:val="0"/>
         </w:rPr>
-        <w:t xml:space="preserve">. La fecha límite es el </w:t>
+        <w:t xml:space="preserve"> al final. La fecha límite es el </w:t>
       </w:r>
       <w:r>
         <w:rPr>
@@ -2164,7 +2467,7 @@
                 <w:b w:val="0"/>
                 <w:sz w:val="20"/>
               </w:rPr>
-              <w:t>Pruebas</w:t>
+              <w:t>Programa principal</w:t>
             </w:r>
           </w:p>
         </w:tc>
@@ -2185,25 +2488,18 @@
             </w:pPr>
             <w:r>
               <w:rPr>
-                <w:b w:val="0"/>
-                <w:sz w:val="20"/>
-              </w:rPr>
-              <w:t xml:space="preserve">Las 4 pruebas existen, tienen </w:t>
-            </w:r>
-            <w:r>
-              <w:rPr>
                 <w:rFonts w:ascii="Consolas" w:hAnsi="Consolas" w:eastAsia="Consolas"/>
                 <w:color w:val="003D7A"/>
                 <w:sz w:val="20"/>
               </w:rPr>
-              <w:t>@DisplayName</w:t>
+              <w:t>Tienda</w:t>
             </w:r>
             <w:r>
               <w:rPr>
                 <w:b w:val="0"/>
                 <w:sz w:val="20"/>
               </w:rPr>
-              <w:t xml:space="preserve"> y pasan</w:t>
+              <w:t xml:space="preserve"> imprime los 4 casos y los números coinciden con la salida esperada</w:t>
             </w:r>
           </w:p>
         </w:tc>
@@ -2293,7 +2589,7 @@
                 <w:b w:val="0"/>
                 <w:sz w:val="20"/>
               </w:rPr>
-              <w:t>, captura en verde</w:t>
+              <w:t xml:space="preserve"> y captura de la salida</w:t>
             </w:r>
           </w:p>
         </w:tc>
@@ -2422,7 +2718,7 @@
           <w:rFonts w:ascii="Consolas" w:hAnsi="Consolas" w:eastAsia="Consolas"/>
           <w:color w:val="003D7A"/>
         </w:rPr>
-        <w:t>gradle test</w:t>
+        <w:t>gradle run</w:t>
       </w:r>
       <w:r>
         <w:rPr>
@@ -2442,6 +2738,18 @@
           <w:b w:val="0"/>
         </w:rPr>
         <w:t xml:space="preserve"> en mi equipo.</w:t>
+      </w:r>
+    </w:p>
+    <w:p>
+      <w:pPr>
+        <w:pStyle w:val="ListBullet"/>
+        <w:spacing w:after="60"/>
+      </w:pPr>
+      <w:r>
+        <w:rPr>
+          <w:b w:val="0"/>
+        </w:rPr>
+        <w:t>Los 4 casos muestran 45000.0, 180000.0, 45000.0 y 64000.0.</w:t>
       </w:r>
     </w:p>
     <w:p>
@@ -2486,7 +2794,7 @@
           <w:rFonts w:ascii="Consolas" w:hAnsi="Consolas" w:eastAsia="Consolas"/>
           <w:color w:val="003D7A"/>
         </w:rPr>
-        <w:t>ProductoTest</w:t>
+        <w:t>Tienda</w:t>
       </w:r>
       <w:r>
         <w:rPr>
@@ -2517,7 +2825,7 @@
         <w:rPr>
           <w:b w:val="0"/>
         </w:rPr>
-        <w:t>Cada clase, método y prueba tiene un comentario corto encima.</w:t>
+        <w:t>Cada clase, atributo y método tiene un comentario corto encima.</w:t>
       </w:r>
     </w:p>
     <w:p>
@@ -2567,7 +2875,20 @@
         <w:rPr>
           <w:b w:val="0"/>
         </w:rPr>
-        <w:t>Adjunté la captura de la ejecución en verde.</w:t>
+        <w:t xml:space="preserve">Adjunté la captura de </w:t>
+      </w:r>
+      <w:r>
+        <w:rPr>
+          <w:rFonts w:ascii="Consolas" w:hAnsi="Consolas" w:eastAsia="Consolas"/>
+          <w:color w:val="003D7A"/>
+        </w:rPr>
+        <w:t>gradle run</w:t>
+      </w:r>
+      <w:r>
+        <w:rPr>
+          <w:b w:val="0"/>
+        </w:rPr>
+        <w:t xml:space="preserve"> con la salida.</w:t>
       </w:r>
     </w:p>
     <w:sectPr>

</xml_diff>

<commit_message>
Clase 1: polimorfismo con métodos sobrecargados y comentarios más claros
El polimorfismo se muestra con la sobrecarga de sumar en la clase nueva
Calculadora; la herencia queda en su propia sección con Perro y Gato.
Los comentarios del código explican con palabras simples qué es cada cosa.
README, guía de estudio y actividad se actualizan con la salida real, el
error de App.java:67 y un reto opcional de sobrecarga en Producto.

Co-Authored-By: Claude Opus 5 (1M context) <noreply@anthropic.com>
Claude-Session: https://claude.ai/code/session_01L2JuF1iG72koPJkmuRWSzm
</commit_message>
<xml_diff>
--- a/material-de-apoyo/Clase1_Actividad_Java_POO.docx
+++ b/material-de-apoyo/Clase1_Actividad_Java_POO.docx
@@ -1813,7 +1813,23 @@
         <w:rPr>
           <w:b w:val="0"/>
         </w:rPr>
-        <w:t xml:space="preserve">Crea una clase </w:t>
+        <w:t>Tiene dos partes pequeñas. Haz una o las dos.</w:t>
+      </w:r>
+    </w:p>
+    <w:p>
+      <w:pPr>
+        <w:pStyle w:val="ListNumber"/>
+        <w:spacing w:after="60"/>
+        <w:numPr>
+          <w:ilvl w:val="0"/>
+          <w:numId w:val="11"/>
+        </w:numPr>
+      </w:pPr>
+      <w:r>
+        <w:rPr>
+          <w:b w:val="0"/>
+        </w:rPr>
+        <w:t xml:space="preserve">Carrito: crea una clase </w:t>
       </w:r>
       <w:r>
         <w:rPr>
@@ -1886,6 +1902,100 @@
           <w:color w:val="003D7A"/>
         </w:rPr>
         <w:t>289000.0</w:t>
+      </w:r>
+      <w:r>
+        <w:rPr>
+          <w:b w:val="0"/>
+        </w:rPr>
+        <w:t>.</w:t>
+      </w:r>
+    </w:p>
+    <w:p>
+      <w:pPr>
+        <w:pStyle w:val="ListNumber"/>
+        <w:spacing w:after="60"/>
+        <w:numPr>
+          <w:ilvl w:val="0"/>
+          <w:numId w:val="11"/>
+        </w:numPr>
+      </w:pPr>
+      <w:r>
+        <w:rPr>
+          <w:b w:val="0"/>
+        </w:rPr>
+        <w:t xml:space="preserve">Sobrecarga: en </w:t>
+      </w:r>
+      <w:r>
+        <w:rPr>
+          <w:rFonts w:ascii="Consolas" w:hAnsi="Consolas" w:eastAsia="Consolas"/>
+          <w:color w:val="003D7A"/>
+        </w:rPr>
+        <w:t>Producto</w:t>
+      </w:r>
+      <w:r>
+        <w:rPr>
+          <w:b w:val="0"/>
+        </w:rPr>
+        <w:t xml:space="preserve"> agrega un segundo método que se llame igual, </w:t>
+      </w:r>
+      <w:r>
+        <w:rPr>
+          <w:rFonts w:ascii="Consolas" w:hAnsi="Consolas" w:eastAsia="Consolas"/>
+          <w:color w:val="003D7A"/>
+        </w:rPr>
+        <w:t>calcularPrecioFinal(int cantidad)</w:t>
+      </w:r>
+      <w:r>
+        <w:rPr>
+          <w:b w:val="0"/>
+        </w:rPr>
+        <w:t xml:space="preserve">, y que devuelva el precio final multiplicado por la cantidad. Es lo mismo que hace </w:t>
+      </w:r>
+      <w:r>
+        <w:rPr>
+          <w:rFonts w:ascii="Consolas" w:hAnsi="Consolas" w:eastAsia="Consolas"/>
+          <w:color w:val="003D7A"/>
+        </w:rPr>
+        <w:t>sumar</w:t>
+      </w:r>
+      <w:r>
+        <w:rPr>
+          <w:b w:val="0"/>
+        </w:rPr>
+        <w:t xml:space="preserve"> en la </w:t>
+      </w:r>
+      <w:r>
+        <w:rPr>
+          <w:rFonts w:ascii="Consolas" w:hAnsi="Consolas" w:eastAsia="Consolas"/>
+          <w:color w:val="003D7A"/>
+        </w:rPr>
+        <w:t>Calculadora</w:t>
+      </w:r>
+      <w:r>
+        <w:rPr>
+          <w:b w:val="0"/>
+        </w:rPr>
+        <w:t xml:space="preserve"> de la clase: mismo nombre, datos distintos. En </w:t>
+      </w:r>
+      <w:r>
+        <w:rPr>
+          <w:rFonts w:ascii="Consolas" w:hAnsi="Consolas" w:eastAsia="Consolas"/>
+          <w:color w:val="003D7A"/>
+        </w:rPr>
+        <w:t>Tienda</w:t>
+      </w:r>
+      <w:r>
+        <w:rPr>
+          <w:b w:val="0"/>
+        </w:rPr>
+        <w:t xml:space="preserve"> imprime el precio de 3 mouse de 45000. Debe dar </w:t>
+      </w:r>
+      <w:r>
+        <w:rPr>
+          <w:rFonts w:ascii="Consolas" w:hAnsi="Consolas" w:eastAsia="Consolas"/>
+          <w:color w:val="003D7A"/>
+        </w:rPr>
+        <w:t>135000.0</w:t>
       </w:r>
       <w:r>
         <w:rPr>
@@ -3136,6 +3246,12 @@
       <w:startOverride w:val="1"/>
     </w:lvlOverride>
   </w:num>
+  <w:num w:numId="11">
+    <w:abstractNumId w:val="7"/>
+    <w:lvlOverride w:ilvl="0">
+      <w:startOverride w:val="1"/>
+    </w:lvlOverride>
+  </w:num>
 </w:numbering>
 </file>
 

</xml_diff>

<commit_message>
Clase 1: interfaces con implements y la diferencia con extends
Paquete nuevo interfaces con Volador, Pajaro y Avion. App queda con 8
secciones: la 7 muestra extends frente a implements y la sobrecarga pasa
a la 8. README, guía de estudio y presentación explican la diferencia con
la tabla comparativa y la salida real; la guía de prerrequisitos ajusta la
numeración de la última sección.

Co-Authored-By: Claude Opus 5 (1M context) <noreply@anthropic.com>
Claude-Session: https://claude.ai/code/session_01L2JuF1iG72koPJkmuRWSzm
</commit_message>
<xml_diff>
--- a/material-de-apoyo/Clase1_Actividad_Java_POO.docx
+++ b/material-de-apoyo/Clase1_Actividad_Java_POO.docx
@@ -1813,7 +1813,7 @@
         <w:rPr>
           <w:b w:val="0"/>
         </w:rPr>
-        <w:t>Tiene dos partes pequeñas. Haz una o las dos.</w:t>
+        <w:t>Tiene tres partes pequeñas. Haz las que quieras.</w:t>
       </w:r>
     </w:p>
     <w:p>
@@ -1975,7 +1975,7 @@
         <w:rPr>
           <w:b w:val="0"/>
         </w:rPr>
-        <w:t xml:space="preserve"> de la clase: mismo nombre, datos distintos. En </w:t>
+        <w:t xml:space="preserve">: mismo nombre, datos distintos. En </w:t>
       </w:r>
       <w:r>
         <w:rPr>
@@ -2002,6 +2002,87 @@
           <w:b w:val="0"/>
         </w:rPr>
         <w:t>.</w:t>
+      </w:r>
+    </w:p>
+    <w:p>
+      <w:pPr>
+        <w:pStyle w:val="ListNumber"/>
+        <w:spacing w:after="60"/>
+        <w:numPr>
+          <w:ilvl w:val="0"/>
+          <w:numId w:val="11"/>
+        </w:numPr>
+      </w:pPr>
+      <w:r>
+        <w:rPr>
+          <w:b w:val="0"/>
+        </w:rPr>
+        <w:t xml:space="preserve">Interfaz: crea </w:t>
+      </w:r>
+      <w:r>
+        <w:rPr>
+          <w:rFonts w:ascii="Consolas" w:hAnsi="Consolas" w:eastAsia="Consolas"/>
+          <w:color w:val="003D7A"/>
+        </w:rPr>
+        <w:t>Descontable.java</w:t>
+      </w:r>
+      <w:r>
+        <w:rPr>
+          <w:b w:val="0"/>
+        </w:rPr>
+        <w:t xml:space="preserve"> con una sola línea adentro, </w:t>
+      </w:r>
+      <w:r>
+        <w:rPr>
+          <w:rFonts w:ascii="Consolas" w:hAnsi="Consolas" w:eastAsia="Consolas"/>
+          <w:color w:val="003D7A"/>
+        </w:rPr>
+        <w:t>double calcularPrecioFinal();</w:t>
+      </w:r>
+      <w:r>
+        <w:rPr>
+          <w:b w:val="0"/>
+        </w:rPr>
+        <w:t xml:space="preserve">, y en </w:t>
+      </w:r>
+      <w:r>
+        <w:rPr>
+          <w:rFonts w:ascii="Consolas" w:hAnsi="Consolas" w:eastAsia="Consolas"/>
+          <w:color w:val="003D7A"/>
+        </w:rPr>
+        <w:t>Producto</w:t>
+      </w:r>
+      <w:r>
+        <w:rPr>
+          <w:b w:val="0"/>
+        </w:rPr>
+        <w:t xml:space="preserve"> escribe </w:t>
+      </w:r>
+      <w:r>
+        <w:rPr>
+          <w:rFonts w:ascii="Consolas" w:hAnsi="Consolas" w:eastAsia="Consolas"/>
+          <w:color w:val="003D7A"/>
+        </w:rPr>
+        <w:t>implements Descontable</w:t>
+      </w:r>
+      <w:r>
+        <w:rPr>
+          <w:b w:val="0"/>
+        </w:rPr>
+        <w:t xml:space="preserve">. </w:t>
+      </w:r>
+      <w:r>
+        <w:rPr>
+          <w:rFonts w:ascii="Consolas" w:hAnsi="Consolas" w:eastAsia="Consolas"/>
+          <w:color w:val="003D7A"/>
+        </w:rPr>
+        <w:t>Producto</w:t>
+      </w:r>
+      <w:r>
+        <w:rPr>
+          <w:b w:val="0"/>
+        </w:rPr>
+        <w:t xml:space="preserve"> ya tiene ese método, así que ya cumple el compromiso; si lo borras, deja de compilar.</w:t>
       </w:r>
     </w:p>
     <w:p>
@@ -2037,7 +2118,7 @@
         <w:rPr>
           <w:b w:val="0"/>
         </w:rPr>
-        <w:t>Tienes dos opciones. Elige una:</w:t>
+        <w:t>Elige una de estas dos opciones:</w:t>
       </w:r>
     </w:p>
     <w:p>
@@ -2108,7 +2189,7 @@
         <w:rPr>
           <w:b w:val="0"/>
         </w:rPr>
-        <w:t xml:space="preserve">En los dos casos adjunta una captura de pantalla de PowerShell con la salida de </w:t>
+        <w:t xml:space="preserve">En los dos casos adjunta una captura de PowerShell con la salida de </w:t>
       </w:r>
       <w:r>
         <w:rPr>
@@ -2121,20 +2202,7 @@
         <w:rPr>
           <w:b w:val="0"/>
         </w:rPr>
-        <w:t xml:space="preserve">: los 4 casos y </w:t>
-      </w:r>
-      <w:r>
-        <w:rPr>
-          <w:rFonts w:ascii="Consolas" w:hAnsi="Consolas" w:eastAsia="Consolas"/>
-          <w:color w:val="003D7A"/>
-        </w:rPr>
-        <w:t>BUILD SUCCESSFUL</w:t>
-      </w:r>
-      <w:r>
-        <w:rPr>
-          <w:b w:val="0"/>
-        </w:rPr>
-        <w:t xml:space="preserve"> al final. La fecha límite es el </w:t>
+        <w:t xml:space="preserve">. La fecha límite es el </w:t>
       </w:r>
       <w:r>
         <w:rPr>
@@ -2794,14 +2862,6 @@
       </w:pPr>
     </w:p>
     <w:p>
-      <w:r>
-        <w:rPr>
-          <w:b w:val="0"/>
-        </w:rPr>
-        <w:t>El reto opcional no cambia la nota.</w:t>
-      </w:r>
-    </w:p>
-    <w:p>
       <w:pPr>
         <w:keepNext/>
         <w:spacing w:before="240" w:after="160"/>
@@ -2847,19 +2907,7 @@
         <w:rPr>
           <w:b w:val="0"/>
         </w:rPr>
-        <w:t xml:space="preserve"> en mi equipo.</w:t>
-      </w:r>
-    </w:p>
-    <w:p>
-      <w:pPr>
-        <w:pStyle w:val="ListBullet"/>
-        <w:spacing w:after="60"/>
-      </w:pPr>
-      <w:r>
-        <w:rPr>
-          <w:b w:val="0"/>
-        </w:rPr>
-        <w:t>Los 4 casos muestran 45000.0, 180000.0, 45000.0 y 64000.0.</w:t>
+        <w:t xml:space="preserve"> y los 4 casos muestran 45000.0, 180000.0, 45000.0 y 64000.0.</w:t>
       </w:r>
     </w:p>
     <w:p>
@@ -2947,7 +2995,7 @@
         <w:rPr>
           <w:b w:val="0"/>
         </w:rPr>
-        <w:t xml:space="preserve">Quité las carpetas </w:t>
+        <w:t xml:space="preserve">Quité </w:t>
       </w:r>
       <w:r>
         <w:rPr>
@@ -2973,32 +3021,7 @@
         <w:rPr>
           <w:b w:val="0"/>
         </w:rPr>
-        <w:t xml:space="preserve"> (si entrego .zip).</w:t>
-      </w:r>
-    </w:p>
-    <w:p>
-      <w:pPr>
-        <w:pStyle w:val="ListBullet"/>
-        <w:spacing w:after="60"/>
-      </w:pPr>
-      <w:r>
-        <w:rPr>
-          <w:b w:val="0"/>
-        </w:rPr>
-        <w:t xml:space="preserve">Adjunté la captura de </w:t>
-      </w:r>
-      <w:r>
-        <w:rPr>
-          <w:rFonts w:ascii="Consolas" w:hAnsi="Consolas" w:eastAsia="Consolas"/>
-          <w:color w:val="003D7A"/>
-        </w:rPr>
-        <w:t>gradle run</w:t>
-      </w:r>
-      <w:r>
-        <w:rPr>
-          <w:b w:val="0"/>
-        </w:rPr>
-        <w:t xml:space="preserve"> con la salida.</w:t>
+        <w:t xml:space="preserve"> (si entrego .zip) y adjunté la captura.</w:t>
       </w:r>
     </w:p>
     <w:sectPr>

</xml_diff>